<commit_message>
docs: actualizar enlaces del informe de actividad 8
</commit_message>
<xml_diff>
--- a/docs/Entrega_Actividad_8_Borys_Alexy_Panezo_Guerrero.docx
+++ b/docs/Entrega_Actividad_8_Borys_Alexy_Panezo_Guerrero.docx
@@ -1819,7 +1819,40 @@
         <w:rPr>
           <w:b w:val="0"/>
         </w:rPr>
-        <w:t>Código fuente: https://github.com/JBorys687/helpdesk-datacenter</w:t>
+        <w:t>Repositorio principal: https://github.com/JBorys687/helpdesk-datacenter</w:t>
+      </w:r>
+    </w:p>
+    <w:p>
+      <w:pPr>
+        <w:jc w:val="both"/>
+      </w:pPr>
+      <w:r>
+        <w:rPr>
+          <w:b w:val="0"/>
+        </w:rPr>
+        <w:t>Rama de desarrollo integrada: https://github.com/JBorys687/helpdesk-datacenter/tree/develop</w:t>
+      </w:r>
+    </w:p>
+    <w:p>
+      <w:pPr>
+        <w:jc w:val="both"/>
+      </w:pPr>
+      <w:r>
+        <w:rPr>
+          <w:b w:val="0"/>
+        </w:rPr>
+        <w:t>Rama de la actividad: https://github.com/JBorys687/helpdesk-datacenter/tree/feature/backend-api</w:t>
+      </w:r>
+    </w:p>
+    <w:p>
+      <w:pPr>
+        <w:jc w:val="both"/>
+      </w:pPr>
+      <w:r>
+        <w:rPr>
+          <w:b w:val="0"/>
+        </w:rPr>
+        <w:t>Commit de implementación: https://github.com/JBorys687/helpdesk-datacenter/commit/a7b6188</w:t>
       </w:r>
     </w:p>
     <w:p>

</xml_diff>

<commit_message>
docs: agregar enlaces interactivos al informe
</commit_message>
<xml_diff>
--- a/docs/Entrega_Actividad_8_Borys_Alexy_Panezo_Guerrero.docx
+++ b/docs/Entrega_Actividad_8_Borys_Alexy_Panezo_Guerrero.docx
@@ -1812,48 +1812,60 @@
       </w:r>
     </w:p>
     <w:p>
-      <w:pPr>
-        <w:jc w:val="both"/>
-      </w:pPr>
-      <w:r>
-        <w:rPr>
-          <w:b w:val="0"/>
-        </w:rPr>
-        <w:t>Repositorio principal: https://github.com/JBorys687/helpdesk-datacenter</w:t>
-      </w:r>
-    </w:p>
-    <w:p>
-      <w:pPr>
-        <w:jc w:val="both"/>
-      </w:pPr>
-      <w:r>
-        <w:rPr>
-          <w:b w:val="0"/>
-        </w:rPr>
-        <w:t>Rama de desarrollo integrada: https://github.com/JBorys687/helpdesk-datacenter/tree/develop</w:t>
-      </w:r>
-    </w:p>
-    <w:p>
-      <w:pPr>
-        <w:jc w:val="both"/>
-      </w:pPr>
-      <w:r>
-        <w:rPr>
-          <w:b w:val="0"/>
-        </w:rPr>
-        <w:t>Rama de la actividad: https://github.com/JBorys687/helpdesk-datacenter/tree/feature/backend-api</w:t>
-      </w:r>
-    </w:p>
-    <w:p>
-      <w:pPr>
-        <w:jc w:val="both"/>
-      </w:pPr>
-      <w:r>
-        <w:rPr>
-          <w:b w:val="0"/>
-        </w:rPr>
-        <w:t>Commit de implementación: https://github.com/JBorys687/helpdesk-datacenter/commit/a7b6188</w:t>
-      </w:r>
+      <w:r>
+        <w:t xml:space="preserve">Repositorio principal: </w:t>
+      </w:r>
+      <w:hyperlink r:id="rId22">
+        <w:r>
+          <w:rPr>
+            <w:color w:val="0563C1"/>
+            <w:u w:val="single"/>
+          </w:rPr>
+          <w:t>https://github.com/JBorys687/helpdesk-datacenter</w:t>
+        </w:r>
+      </w:hyperlink>
+    </w:p>
+    <w:p>
+      <w:r>
+        <w:t xml:space="preserve">Rama de desarrollo integrada: </w:t>
+      </w:r>
+      <w:hyperlink r:id="rId23">
+        <w:r>
+          <w:rPr>
+            <w:color w:val="0563C1"/>
+            <w:u w:val="single"/>
+          </w:rPr>
+          <w:t>https://github.com/JBorys687/helpdesk-datacenter/tree/develop</w:t>
+        </w:r>
+      </w:hyperlink>
+    </w:p>
+    <w:p>
+      <w:r>
+        <w:t xml:space="preserve">Rama de la actividad: </w:t>
+      </w:r>
+      <w:hyperlink r:id="rId24">
+        <w:r>
+          <w:rPr>
+            <w:color w:val="0563C1"/>
+            <w:u w:val="single"/>
+          </w:rPr>
+          <w:t>https://github.com/JBorys687/helpdesk-datacenter/tree/feature/backend-api</w:t>
+        </w:r>
+      </w:hyperlink>
+    </w:p>
+    <w:p>
+      <w:r>
+        <w:t xml:space="preserve">Commit de implementación: </w:t>
+      </w:r>
+      <w:hyperlink r:id="rId25">
+        <w:r>
+          <w:rPr>
+            <w:color w:val="0563C1"/>
+            <w:u w:val="single"/>
+          </w:rPr>
+          <w:t>https://github.com/JBorys687/helpdesk-datacenter/commit/a7b6188</w:t>
+        </w:r>
+      </w:hyperlink>
     </w:p>
     <w:p>
       <w:pPr>

</xml_diff>

<commit_message>
docs: incluir enlace de Google Drive en la entrega
</commit_message>
<xml_diff>
--- a/docs/Entrega_Actividad_8_Borys_Alexy_Panezo_Guerrero.docx
+++ b/docs/Entrega_Actividad_8_Borys_Alexy_Panezo_Guerrero.docx
@@ -1864,6 +1864,29 @@
             <w:u w:val="single"/>
           </w:rPr>
           <w:t>https://github.com/JBorys687/helpdesk-datacenter/commit/a7b6188</w:t>
+        </w:r>
+      </w:hyperlink>
+    </w:p>
+    <w:p>
+      <w:pPr>
+        <w:pStyle w:val="Ttulo1"/>
+        <w:jc w:val="left"/>
+      </w:pPr>
+      <w:r>
+        <w:t>Archivos de la aplicación en Google Drive</w:t>
+      </w:r>
+    </w:p>
+    <w:p>
+      <w:r>
+        <w:t xml:space="preserve">Carpeta compartida de la Actividad 8: </w:t>
+      </w:r>
+      <w:hyperlink r:id="rId26">
+        <w:r>
+          <w:rPr>
+            <w:color w:val="0563C1"/>
+            <w:u w:val="single"/>
+          </w:rPr>
+          <w:t>https://drive.google.com/drive/folders/1Ymn-EO8LBrUPv6qqT2ASUzFPNta5Pf9b?usp=sharing</w:t>
         </w:r>
       </w:hyperlink>
     </w:p>

</xml_diff>